<commit_message>
Added Week 4 AES implementation and updated logbook
</commit_message>
<xml_diff>
--- a/BIT 4138; Advanced Cryptography logbook .docx
+++ b/BIT 4138; Advanced Cryptography logbook .docx
@@ -428,7 +428,7 @@
           <w:noProof/>
         </w:rPr>
         <w:drawing>
-          <wp:inline distT="0" distB="0" distL="0" distR="0" wp14:anchorId="36EAD0D3" wp14:editId="7950F352">
+          <wp:inline distT="0" distB="0" distL="0" distR="0" wp14:anchorId="36EAD0D3" wp14:editId="42AA37A3">
             <wp:extent cx="5943600" cy="2475230"/>
             <wp:effectExtent l="0" t="0" r="0" b="1270"/>
             <wp:docPr id="1452666835" name="Picture 1"/>
@@ -512,7 +512,7 @@
           <w:noProof/>
         </w:rPr>
         <w:drawing>
-          <wp:inline distT="0" distB="0" distL="0" distR="0" wp14:anchorId="57BBA710" wp14:editId="7108CA97">
+          <wp:inline distT="0" distB="0" distL="0" distR="0" wp14:anchorId="57BBA710" wp14:editId="6047EF0A">
             <wp:extent cx="5943600" cy="3225800"/>
             <wp:effectExtent l="0" t="0" r="0" b="0"/>
             <wp:docPr id="1146746702" name="Picture 1"/>
@@ -1187,7 +1187,7 @@
           <w:noProof/>
         </w:rPr>
         <w:drawing>
-          <wp:inline distT="0" distB="0" distL="0" distR="0" wp14:anchorId="3D247868" wp14:editId="48940731">
+          <wp:inline distT="0" distB="0" distL="0" distR="0" wp14:anchorId="3D247868" wp14:editId="5DF021A7">
             <wp:extent cx="5943600" cy="2558415"/>
             <wp:effectExtent l="0" t="0" r="0" b="0"/>
             <wp:docPr id="2108466837" name="Picture 3"/>
@@ -1236,7 +1236,7 @@
         </w:rPr>
         <w:lastRenderedPageBreak/>
         <w:drawing>
-          <wp:inline distT="0" distB="0" distL="0" distR="0" wp14:anchorId="2DCF80EA" wp14:editId="1D14F8A8">
+          <wp:inline distT="0" distB="0" distL="0" distR="0" wp14:anchorId="2DCF80EA" wp14:editId="63841A41">
             <wp:extent cx="5943600" cy="943610"/>
             <wp:effectExtent l="0" t="0" r="0" b="8890"/>
             <wp:docPr id="2119086713" name="Picture 4"/>
@@ -1301,7 +1301,7 @@
           <w:noProof/>
         </w:rPr>
         <w:drawing>
-          <wp:inline distT="0" distB="0" distL="0" distR="0" wp14:anchorId="3A8C0AC1" wp14:editId="57FD7DB6">
+          <wp:inline distT="0" distB="0" distL="0" distR="0" wp14:anchorId="3A8C0AC1" wp14:editId="1EACBAB9">
             <wp:extent cx="5943600" cy="3324225"/>
             <wp:effectExtent l="0" t="0" r="0" b="9525"/>
             <wp:docPr id="264846924" name="Picture 5"/>
@@ -1364,7 +1364,7 @@
         </w:rPr>
         <w:lastRenderedPageBreak/>
         <w:drawing>
-          <wp:inline distT="0" distB="0" distL="0" distR="0" wp14:anchorId="52DA3A8C" wp14:editId="7A64EA20">
+          <wp:inline distT="0" distB="0" distL="0" distR="0" wp14:anchorId="52DA3A8C" wp14:editId="77E170AE">
             <wp:extent cx="5943600" cy="3356610"/>
             <wp:effectExtent l="0" t="0" r="0" b="0"/>
             <wp:docPr id="1084858864" name="Picture 6"/>
@@ -1407,6 +1407,355 @@
       </w:r>
     </w:p>
     <w:p/>
+    <w:p>
+      <w:r>
+        <w:t>Stream ciphers generate keystreams used for bit-by-bit encryption. Randomness is essential for security, ensuring unpredictability of output sequences. Statistical tests were performed to evaluate pseudorandom generation quality, highlighting its importance in preventing pattern-based cryptographic attacks.</w:t>
+      </w:r>
+    </w:p>
+    <w:p/>
+    <w:p/>
+    <w:p/>
+    <w:p/>
+    <w:p/>
+    <w:p/>
+    <w:p/>
+    <w:p/>
+    <w:p/>
+    <w:p/>
+    <w:p/>
+    <w:p>
+      <w:r>
+        <w:lastRenderedPageBreak/>
+        <w:t xml:space="preserve">Week 4; Block Cipher Design and AES </w:t>
+      </w:r>
+    </w:p>
+    <w:p>
+      <w:r>
+        <w:t>Advanced Encryption standard and Bloc</w:t>
+      </w:r>
+      <w:r>
+        <w:t xml:space="preserve">k Cipher operations </w:t>
+      </w:r>
+    </w:p>
+    <w:p/>
+    <w:p>
+      <w:r>
+        <w:t xml:space="preserve">FIG 1; AES Encryption Script </w:t>
+      </w:r>
+    </w:p>
+    <w:p>
+      <w:r>
+        <w:rPr>
+          <w:noProof/>
+        </w:rPr>
+        <w:drawing>
+          <wp:inline distT="0" distB="0" distL="0" distR="0" wp14:anchorId="270AF4D1" wp14:editId="0558167F">
+            <wp:extent cx="5943600" cy="3446145"/>
+            <wp:effectExtent l="0" t="0" r="0" b="1905"/>
+            <wp:docPr id="1187196502" name="Picture 2"/>
+            <wp:cNvGraphicFramePr>
+              <a:graphicFrameLocks xmlns:a="http://schemas.openxmlformats.org/drawingml/2006/main" noChangeAspect="1"/>
+            </wp:cNvGraphicFramePr>
+            <a:graphic xmlns:a="http://schemas.openxmlformats.org/drawingml/2006/main">
+              <a:graphicData uri="http://schemas.openxmlformats.org/drawingml/2006/picture">
+                <pic:pic xmlns:pic="http://schemas.openxmlformats.org/drawingml/2006/picture">
+                  <pic:nvPicPr>
+                    <pic:cNvPr id="1187196502" name="Picture 1187196502"/>
+                    <pic:cNvPicPr/>
+                  </pic:nvPicPr>
+                  <pic:blipFill>
+                    <a:blip r:embed="rId25" cstate="print">
+                      <a:extLst>
+                        <a:ext uri="{28A0092B-C50C-407E-A947-70E740481C1C}">
+                          <a14:useLocalDpi xmlns:a14="http://schemas.microsoft.com/office/drawing/2010/main" val="0"/>
+                        </a:ext>
+                      </a:extLst>
+                    </a:blip>
+                    <a:stretch>
+                      <a:fillRect/>
+                    </a:stretch>
+                  </pic:blipFill>
+                  <pic:spPr>
+                    <a:xfrm>
+                      <a:off x="0" y="0"/>
+                      <a:ext cx="5943600" cy="3446145"/>
+                    </a:xfrm>
+                    <a:prstGeom prst="rect">
+                      <a:avLst/>
+                    </a:prstGeom>
+                  </pic:spPr>
+                </pic:pic>
+              </a:graphicData>
+            </a:graphic>
+          </wp:inline>
+        </w:drawing>
+      </w:r>
+    </w:p>
+    <w:p/>
+    <w:p/>
+    <w:p>
+      <w:r>
+        <w:t xml:space="preserve">FIG </w:t>
+      </w:r>
+      <w:proofErr w:type="gramStart"/>
+      <w:r>
+        <w:t>2 ;</w:t>
+      </w:r>
+      <w:proofErr w:type="gramEnd"/>
+      <w:r>
+        <w:t xml:space="preserve"> </w:t>
+      </w:r>
+      <w:r>
+        <w:t>Key Generation Process</w:t>
+      </w:r>
+    </w:p>
+    <w:p>
+      <w:r>
+        <w:rPr>
+          <w:noProof/>
+        </w:rPr>
+        <w:lastRenderedPageBreak/>
+        <w:drawing>
+          <wp:inline distT="0" distB="0" distL="0" distR="0" wp14:anchorId="1D2200AA" wp14:editId="43251611">
+            <wp:extent cx="5943600" cy="3434080"/>
+            <wp:effectExtent l="0" t="0" r="0" b="0"/>
+            <wp:docPr id="262425837" name="Picture 1"/>
+            <wp:cNvGraphicFramePr>
+              <a:graphicFrameLocks xmlns:a="http://schemas.openxmlformats.org/drawingml/2006/main" noChangeAspect="1"/>
+            </wp:cNvGraphicFramePr>
+            <a:graphic xmlns:a="http://schemas.openxmlformats.org/drawingml/2006/main">
+              <a:graphicData uri="http://schemas.openxmlformats.org/drawingml/2006/picture">
+                <pic:pic xmlns:pic="http://schemas.openxmlformats.org/drawingml/2006/picture">
+                  <pic:nvPicPr>
+                    <pic:cNvPr id="262425837" name="Picture 262425837"/>
+                    <pic:cNvPicPr/>
+                  </pic:nvPicPr>
+                  <pic:blipFill>
+                    <a:blip r:embed="rId26" cstate="print">
+                      <a:extLst>
+                        <a:ext uri="{28A0092B-C50C-407E-A947-70E740481C1C}">
+                          <a14:useLocalDpi xmlns:a14="http://schemas.microsoft.com/office/drawing/2010/main" val="0"/>
+                        </a:ext>
+                      </a:extLst>
+                    </a:blip>
+                    <a:stretch>
+                      <a:fillRect/>
+                    </a:stretch>
+                  </pic:blipFill>
+                  <pic:spPr>
+                    <a:xfrm>
+                      <a:off x="0" y="0"/>
+                      <a:ext cx="5943600" cy="3434080"/>
+                    </a:xfrm>
+                    <a:prstGeom prst="rect">
+                      <a:avLst/>
+                    </a:prstGeom>
+                  </pic:spPr>
+                </pic:pic>
+              </a:graphicData>
+            </a:graphic>
+          </wp:inline>
+        </w:drawing>
+      </w:r>
+    </w:p>
+    <w:p>
+      <w:r>
+        <w:t>FI</w:t>
+      </w:r>
+      <w:r>
+        <w:t xml:space="preserve">G </w:t>
+      </w:r>
+      <w:proofErr w:type="gramStart"/>
+      <w:r>
+        <w:t>3 ;</w:t>
+      </w:r>
+      <w:proofErr w:type="gramEnd"/>
+      <w:r>
+        <w:t xml:space="preserve"> File encryption Demonstration </w:t>
+      </w:r>
+    </w:p>
+    <w:p>
+      <w:r>
+        <w:rPr>
+          <w:noProof/>
+        </w:rPr>
+        <w:drawing>
+          <wp:inline distT="0" distB="0" distL="0" distR="0" wp14:anchorId="6608050A" wp14:editId="70363A4C">
+            <wp:extent cx="5943600" cy="3446145"/>
+            <wp:effectExtent l="0" t="0" r="0" b="1905"/>
+            <wp:docPr id="1469873442" name="Picture 3"/>
+            <wp:cNvGraphicFramePr>
+              <a:graphicFrameLocks xmlns:a="http://schemas.openxmlformats.org/drawingml/2006/main" noChangeAspect="1"/>
+            </wp:cNvGraphicFramePr>
+            <a:graphic xmlns:a="http://schemas.openxmlformats.org/drawingml/2006/main">
+              <a:graphicData uri="http://schemas.openxmlformats.org/drawingml/2006/picture">
+                <pic:pic xmlns:pic="http://schemas.openxmlformats.org/drawingml/2006/picture">
+                  <pic:nvPicPr>
+                    <pic:cNvPr id="1469873442" name="Picture 1469873442"/>
+                    <pic:cNvPicPr/>
+                  </pic:nvPicPr>
+                  <pic:blipFill>
+                    <a:blip r:embed="rId25" cstate="print">
+                      <a:extLst>
+                        <a:ext uri="{28A0092B-C50C-407E-A947-70E740481C1C}">
+                          <a14:useLocalDpi xmlns:a14="http://schemas.microsoft.com/office/drawing/2010/main" val="0"/>
+                        </a:ext>
+                      </a:extLst>
+                    </a:blip>
+                    <a:stretch>
+                      <a:fillRect/>
+                    </a:stretch>
+                  </pic:blipFill>
+                  <pic:spPr>
+                    <a:xfrm>
+                      <a:off x="0" y="0"/>
+                      <a:ext cx="5943600" cy="3446145"/>
+                    </a:xfrm>
+                    <a:prstGeom prst="rect">
+                      <a:avLst/>
+                    </a:prstGeom>
+                  </pic:spPr>
+                </pic:pic>
+              </a:graphicData>
+            </a:graphic>
+          </wp:inline>
+        </w:drawing>
+      </w:r>
+    </w:p>
+    <w:p/>
+    <w:p>
+      <w:r>
+        <w:lastRenderedPageBreak/>
+        <w:t xml:space="preserve">FIG </w:t>
+      </w:r>
+      <w:proofErr w:type="gramStart"/>
+      <w:r>
+        <w:t>4 ;</w:t>
+      </w:r>
+      <w:proofErr w:type="gramEnd"/>
+      <w:r>
+        <w:t xml:space="preserve"> Decryption Results </w:t>
+      </w:r>
+      <w:r>
+        <w:rPr>
+          <w:noProof/>
+        </w:rPr>
+        <w:drawing>
+          <wp:inline distT="0" distB="0" distL="0" distR="0" wp14:anchorId="0D50EFCB" wp14:editId="0AA91C70">
+            <wp:extent cx="5943600" cy="3256915"/>
+            <wp:effectExtent l="0" t="0" r="0" b="635"/>
+            <wp:docPr id="1143204175" name="Picture 4"/>
+            <wp:cNvGraphicFramePr>
+              <a:graphicFrameLocks xmlns:a="http://schemas.openxmlformats.org/drawingml/2006/main" noChangeAspect="1"/>
+            </wp:cNvGraphicFramePr>
+            <a:graphic xmlns:a="http://schemas.openxmlformats.org/drawingml/2006/main">
+              <a:graphicData uri="http://schemas.openxmlformats.org/drawingml/2006/picture">
+                <pic:pic xmlns:pic="http://schemas.openxmlformats.org/drawingml/2006/picture">
+                  <pic:nvPicPr>
+                    <pic:cNvPr id="1143204175" name="Picture 1143204175"/>
+                    <pic:cNvPicPr/>
+                  </pic:nvPicPr>
+                  <pic:blipFill>
+                    <a:blip r:embed="rId27" cstate="print">
+                      <a:extLst>
+                        <a:ext uri="{28A0092B-C50C-407E-A947-70E740481C1C}">
+                          <a14:useLocalDpi xmlns:a14="http://schemas.microsoft.com/office/drawing/2010/main" val="0"/>
+                        </a:ext>
+                      </a:extLst>
+                    </a:blip>
+                    <a:stretch>
+                      <a:fillRect/>
+                    </a:stretch>
+                  </pic:blipFill>
+                  <pic:spPr>
+                    <a:xfrm>
+                      <a:off x="0" y="0"/>
+                      <a:ext cx="5943600" cy="3256915"/>
+                    </a:xfrm>
+                    <a:prstGeom prst="rect">
+                      <a:avLst/>
+                    </a:prstGeom>
+                  </pic:spPr>
+                </pic:pic>
+              </a:graphicData>
+            </a:graphic>
+          </wp:inline>
+        </w:drawing>
+      </w:r>
+    </w:p>
+    <w:p/>
+    <w:p/>
+    <w:p/>
+    <w:p/>
+    <w:p/>
+    <w:p>
+      <w:r>
+        <w:t xml:space="preserve">FIG </w:t>
+      </w:r>
+      <w:proofErr w:type="gramStart"/>
+      <w:r>
+        <w:t>5 ;</w:t>
+      </w:r>
+      <w:proofErr w:type="gramEnd"/>
+      <w:r>
+        <w:t xml:space="preserve"> AES Performance Testing </w:t>
+      </w:r>
+    </w:p>
+    <w:p>
+      <w:r>
+        <w:rPr>
+          <w:noProof/>
+        </w:rPr>
+        <w:lastRenderedPageBreak/>
+        <w:drawing>
+          <wp:inline distT="0" distB="0" distL="0" distR="0" wp14:anchorId="34D74F7F" wp14:editId="378066A3">
+            <wp:extent cx="5943600" cy="3298190"/>
+            <wp:effectExtent l="0" t="0" r="0" b="0"/>
+            <wp:docPr id="474399364" name="Picture 5"/>
+            <wp:cNvGraphicFramePr>
+              <a:graphicFrameLocks xmlns:a="http://schemas.openxmlformats.org/drawingml/2006/main" noChangeAspect="1"/>
+            </wp:cNvGraphicFramePr>
+            <a:graphic xmlns:a="http://schemas.openxmlformats.org/drawingml/2006/main">
+              <a:graphicData uri="http://schemas.openxmlformats.org/drawingml/2006/picture">
+                <pic:pic xmlns:pic="http://schemas.openxmlformats.org/drawingml/2006/picture">
+                  <pic:nvPicPr>
+                    <pic:cNvPr id="474399364" name="Picture 474399364"/>
+                    <pic:cNvPicPr/>
+                  </pic:nvPicPr>
+                  <pic:blipFill>
+                    <a:blip r:embed="rId28" cstate="print">
+                      <a:extLst>
+                        <a:ext uri="{28A0092B-C50C-407E-A947-70E740481C1C}">
+                          <a14:useLocalDpi xmlns:a14="http://schemas.microsoft.com/office/drawing/2010/main" val="0"/>
+                        </a:ext>
+                      </a:extLst>
+                    </a:blip>
+                    <a:stretch>
+                      <a:fillRect/>
+                    </a:stretch>
+                  </pic:blipFill>
+                  <pic:spPr>
+                    <a:xfrm>
+                      <a:off x="0" y="0"/>
+                      <a:ext cx="5943600" cy="3298190"/>
+                    </a:xfrm>
+                    <a:prstGeom prst="rect">
+                      <a:avLst/>
+                    </a:prstGeom>
+                  </pic:spPr>
+                </pic:pic>
+              </a:graphicData>
+            </a:graphic>
+          </wp:inline>
+        </w:drawing>
+      </w:r>
+    </w:p>
+    <w:p/>
+    <w:p>
+      <w:r>
+        <w:t>AES is a symmetric block cipher that encrypts data in fixed-size blocks using secure keys. The process involves key generation, encryption, and decryption. Key protection is critical, and challenges included padding, file handling, and maintaining encryption-decryption consistency.</w:t>
+      </w:r>
+    </w:p>
     <w:p/>
     <w:sectPr>
       <w:pgSz w:w="12240" w:h="15840"/>
@@ -2021,7 +2370,6 @@
   <w:style w:type="character" w:default="1" w:styleId="DefaultParagraphFont">
     <w:name w:val="Default Paragraph Font"/>
     <w:uiPriority w:val="1"/>
-    <w:semiHidden/>
     <w:unhideWhenUsed/>
   </w:style>
   <w:style w:type="table" w:default="1" w:styleId="TableNormal">

</xml_diff>